<commit_message>
reescreve documento com dados reais dos sensores e base no contrato da Sprint 3
</commit_message>
<xml_diff>
--- a/governanca/documento/Checkpoint_Governanca_Observabilidade.docx
+++ b/governanca/documento/Checkpoint_Governanca_Observabilidade.docx
@@ -309,7 +309,7 @@
       </w:pPr>
       <w:r>
         <w:rPr/>
-        <w:t>Este trabalho define e valida um contrato mínimo de observabilidade para o endpoint de sensores do Forzy Digital Twin. O grupo expôs o provider de Sensores como uma API FastAPI com rotas de leitura atual, histórico e observabilidade, e implementou um middleware que grava em SQLite, a cada chamada, os headers de contexto X-Session-Id e X-Feature, o instante em UTC, a latência, o código de status, a idade do dado e a completude do payload. A partir desses campos mapeamos 16 indicadores, entre eles latência p95, disponibilidade, freshness, taxa de completude de freshness, tempo de atualização e cobertura de headers. Cada indicador recebeu definição, fórmula, baseline, limiar de alerta, limiar crítico, visualização recomendada e ação de resposta, reunidos num arquivo YAML versionado junto com o código. A baseline foi medida sobre 300 chamadas de operação normal, sem problemas de cliente, e a conformidade foi avaliada sobre 600 chamadas de um cenário misto, que inclui um cliente legado sem headers, consultas a tags inexistentes e maior concorrência. Na avaliação, 9 indicadores ficaram dentro dos limiares, 2 em alerta e 3 em nível crítico (taxa de erro 4xx, taxa de completude de freshness, maior lacuna no histórico). A interface em Streamlit consome os três endpoints com a biblioteca requests e mostra os indicadores com os mesmos gráficos propostos neste documento. Os registros permitiram identificar o cliente que chamava sem contexto pelo user agent, separar erros de cliente de falhas da fonte de dados e medir atrasos do coletor que a interface sozinha não mostraria.</w:t>
+        <w:t>Este trabalho define e valida um contrato mínimo de observabilidade para o endpoint de sensores do Forzy Digital Twin, que acompanha os sensores S1 e S2 de um motor WEG W22. O grupo expôs o provider de Sensores como uma API FastAPI com rotas de leitura atual, histórico e observabilidade, e implementou um middleware que grava em SQLite, a cada chamada, os headers de contexto X-Session-Id e X-Feature, o instante em UTC, a latência, o código de status, a idade do dado e a completude do payload. A partir desses campos mapeamos 16 indicadores, entre eles latência p95, disponibilidade, freshness, taxa de completude de freshness, tempo de atualização e cobertura de headers. Cada indicador recebeu definição, fórmula, baseline, limiar de alerta, limiar crítico, visualização recomendada e ação de resposta, reunidos num arquivo YAML versionado junto com o código e alinhados ao Metric Contract da Sprint 3. As leituras servidas pela API vêm do histórico real dos dois sensores, repetido sobre o relógio atual, e só a coleta é simulada. A baseline foi medida sobre 300 chamadas de operação normal, sem problemas de cliente, e a conformidade foi avaliada sobre 600 chamadas de um cenário misto, que inclui um cliente legado sem headers, consultas a sensores inexistentes e maior concorrência. Na avaliação, 10 indicadores ficaram dentro dos limiares, 2 em alerta e 2 em nível crítico (taxa de erro 4xx, proporção de leituras críticas). A interface em Streamlit consome os três endpoints com a biblioteca requests e mostra os indicadores com os mesmos gráficos propostos neste documento. Os registros permitiram identificar pelo user agent o cliente que chamava sem contexto, separar erros de cliente de falhas de coleta e mostrar que, com os limiares da Sprint 3, o motor em operação cai quase sempre na zona crítica de vibração, ponto que pede revisão do contrato.</w:t>
       </w:r>
     </w:p>
     <w:p>
@@ -648,9 +648,9 @@
         <w:jc w:val="left"/>
       </w:pPr>
       <w:r>
-        <w:t>CLP</w:t>
+        <w:t>HTTP</w:t>
         <w:tab/>
-        <w:t>Controlador Lógico Programável</w:t>
+        <w:t>Hypertext Transfer Protocol</w:t>
       </w:r>
     </w:p>
     <w:p>
@@ -662,9 +662,9 @@
         <w:jc w:val="left"/>
       </w:pPr>
       <w:r>
-        <w:t>HTTP</w:t>
+        <w:t>IA</w:t>
         <w:tab/>
-        <w:t>Hypertext Transfer Protocol</w:t>
+        <w:t>Inteligência Artificial</w:t>
       </w:r>
     </w:p>
     <w:p>
@@ -676,9 +676,9 @@
         <w:jc w:val="left"/>
       </w:pPr>
       <w:r>
-        <w:t>IA</w:t>
+        <w:t>IEC</w:t>
         <w:tab/>
-        <w:t>Inteligência Artificial</w:t>
+        <w:t>International Electrotechnical Commission</w:t>
       </w:r>
     </w:p>
     <w:p>
@@ -690,9 +690,9 @@
         <w:jc w:val="left"/>
       </w:pPr>
       <w:r>
-        <w:t>IEC</w:t>
+        <w:t>ISO</w:t>
         <w:tab/>
-        <w:t>International Electrotechnical Commission</w:t>
+        <w:t>International Organization for Standardization</w:t>
       </w:r>
     </w:p>
     <w:p>
@@ -704,9 +704,9 @@
         <w:jc w:val="left"/>
       </w:pPr>
       <w:r>
-        <w:t>ISO</w:t>
+        <w:t>JSON</w:t>
         <w:tab/>
-        <w:t>International Organization for Standardization</w:t>
+        <w:t>JavaScript Object Notation</w:t>
       </w:r>
     </w:p>
     <w:p>
@@ -718,9 +718,9 @@
         <w:jc w:val="left"/>
       </w:pPr>
       <w:r>
-        <w:t>JSON</w:t>
+        <w:t>KPI</w:t>
         <w:tab/>
-        <w:t>JavaScript Object Notation</w:t>
+        <w:t>Key Performance Indicator</w:t>
       </w:r>
     </w:p>
     <w:p>
@@ -732,9 +732,9 @@
         <w:jc w:val="left"/>
       </w:pPr>
       <w:r>
-        <w:t>KPI</w:t>
+        <w:t>MES</w:t>
         <w:tab/>
-        <w:t>Key Performance Indicator</w:t>
+        <w:t>Manufacturing Execution System</w:t>
       </w:r>
     </w:p>
     <w:p>
@@ -746,9 +746,9 @@
         <w:jc w:val="left"/>
       </w:pPr>
       <w:r>
-        <w:t>MES</w:t>
+        <w:t>NBR</w:t>
         <w:tab/>
-        <w:t>Manufacturing Execution System</w:t>
+        <w:t>Norma Brasileira</w:t>
       </w:r>
     </w:p>
     <w:p>
@@ -760,9 +760,9 @@
         <w:jc w:val="left"/>
       </w:pPr>
       <w:r>
-        <w:t>NBR</w:t>
+        <w:t>NIST</w:t>
         <w:tab/>
-        <w:t>Norma Brasileira</w:t>
+        <w:t>National Institute of Standards and Technology</w:t>
       </w:r>
     </w:p>
     <w:p>
@@ -774,9 +774,9 @@
         <w:jc w:val="left"/>
       </w:pPr>
       <w:r>
-        <w:t>NIST</w:t>
+        <w:t>RBAC</w:t>
         <w:tab/>
-        <w:t>National Institute of Standards and Technology</w:t>
+        <w:t>Role-Based Access Control</w:t>
       </w:r>
     </w:p>
     <w:p>
@@ -802,9 +802,9 @@
         <w:jc w:val="left"/>
       </w:pPr>
       <w:r>
-        <w:t>RMF</w:t>
+        <w:t>RMS</w:t>
         <w:tab/>
-        <w:t>Risk Management Framework</w:t>
+        <w:t>Root Mean Square</w:t>
       </w:r>
     </w:p>
     <w:p>
@@ -816,9 +816,9 @@
         <w:jc w:val="left"/>
       </w:pPr>
       <w:r>
-        <w:t>SLI</w:t>
+        <w:t>RMF</w:t>
         <w:tab/>
-        <w:t>Service Level Indicator</w:t>
+        <w:t>Risk Management Framework</w:t>
       </w:r>
     </w:p>
     <w:p>
@@ -830,9 +830,9 @@
         <w:jc w:val="left"/>
       </w:pPr>
       <w:r>
-        <w:t>SLO</w:t>
+        <w:t>SLI</w:t>
         <w:tab/>
-        <w:t>Service Level Objective</w:t>
+        <w:t>Service Level Indicator</w:t>
       </w:r>
     </w:p>
     <w:p>
@@ -844,9 +844,9 @@
         <w:jc w:val="left"/>
       </w:pPr>
       <w:r>
-        <w:t>SQL</w:t>
+        <w:t>SLO</w:t>
         <w:tab/>
-        <w:t>Structured Query Language</w:t>
+        <w:t>Service Level Objective</w:t>
       </w:r>
     </w:p>
     <w:p>
@@ -858,9 +858,9 @@
         <w:jc w:val="left"/>
       </w:pPr>
       <w:r>
-        <w:t>SRE</w:t>
+        <w:t>SQL</w:t>
         <w:tab/>
-        <w:t>Site Reliability Engineering</w:t>
+        <w:t>Structured Query Language</w:t>
       </w:r>
     </w:p>
     <w:p>
@@ -872,9 +872,9 @@
         <w:jc w:val="left"/>
       </w:pPr>
       <w:r>
-        <w:t>UTC</w:t>
+        <w:t>SRE</w:t>
         <w:tab/>
-        <w:t>Tempo Universal Coordenado</w:t>
+        <w:t>Site Reliability Engineering</w:t>
       </w:r>
     </w:p>
     <w:p>
@@ -886,9 +886,9 @@
         <w:jc w:val="left"/>
       </w:pPr>
       <w:r>
-        <w:t>UUID</w:t>
+        <w:t>UTC</w:t>
         <w:tab/>
-        <w:t>Universally Unique Identifier</w:t>
+        <w:t>Tempo Universal Coordenado</w:t>
       </w:r>
     </w:p>
     <w:p>
@@ -900,6 +900,20 @@
         <w:jc w:val="left"/>
       </w:pPr>
       <w:r>
+        <w:t>UUID</w:t>
+        <w:tab/>
+        <w:t>Universally Unique Identifier</w:t>
+      </w:r>
+    </w:p>
+    <w:p>
+      <w:pPr>
+        <w:tabs>
+          <w:tab w:pos="1417" w:val="left"/>
+        </w:tabs>
+        <w:ind w:firstLine="0"/>
+        <w:jc w:val="left"/>
+      </w:pPr>
+      <w:r>
         <w:t>YAML</w:t>
         <w:tab/>
         <w:t>YAML Ain't Markup Language</w:t>
@@ -1041,7 +1055,7 @@
       </w:pPr>
       <w:r>
         <w:rPr/>
-        <w:t>3.4 PROVIDER SIMULADO</w:t>
+        <w:t>3.4 ORIGEM DOS DADOS: HISTÓRICO REAL E COLETA SIMULADA</w:t>
       </w:r>
     </w:p>
     <w:p>
@@ -1188,7 +1202,7 @@
       <w:pPr/>
       <w:r>
         <w:rPr/>
-        <w:t>O Forzy Digital Twin é a solução que o grupo vem desenvolvendo no Challenge da Forzy para acompanhar equipamentos industriais a partir de leituras de sensores. Uma das partes da solução é o provider de Sensores, que devolve a leitura mais recente de uma tag e o histórico de leituras num intervalo. Essas leituras alimentam a classificação de severidade mostrada ao operador e, mais adiante, os modelos de IA do gêmeo digital.</w:t>
+        <w:t>O Forzy Digital Twin é a solução que o grupo vem desenvolvendo no Challenge da Forzy para acompanhar motores industriais a partir de leituras de sensores. O ativo de referência é um motor WEG W22 de 2,2 kW com dois sensores, S1 e S2, que medem velocidade de vibração, aceleração e temperatura. No forzy-api, um poller consulta os dois sensores a cada 10 s e grava as leituras no banco; o provider de Sensores devolve a leitura mais recente e o histórico de cada um. Essas leituras alimentam a classificação de severidade mostrada ao operador e os modelos de IA do gêmeo digital (Isolation Forest e LSTM Autoencoder).</w:t>
       </w:r>
     </w:p>
     <w:p>
@@ -1209,7 +1223,7 @@
       <w:pPr/>
       <w:r>
         <w:rPr/>
-        <w:t>O escopo segue o enunciado do checkpoint e fica menor que o da Sprint 4. Só o provider de Sensores (leitura atual e histórico) foi exposto, sem autenticação e sem migrar os providers de Equipamentos e Plantas. O provider usado aqui é simulado, com falhas de coleta reproduzidas de propósito, como explica a seção 3.4. O tema também deve entrar no próximo entregável do Challenge da Forzy, como recomenda o enunciado.</w:t>
+        <w:t>O escopo segue o enunciado do checkpoint e fica menor que o da Sprint 4. Só o provider de Sensores (leitura atual e histórico) foi exposto, sem autenticação e sem migrar os providers de Equipamentos e Plantas. Os valores servidos são o histórico real dos sensores e só a coleta é simulada, como explica a seção 3.4. Os limiares de condição do motor e as regras de qualidade de dado foram herdados do Metric Contract da Sprint 3 (GOMES et al., 2026), e este checkpoint acrescenta a camada que faltava: medir a própria API e o dado que ela entrega. O tema também deve entrar no próximo entregável do Challenge, como recomenda o enunciado.</w:t>
       </w:r>
     </w:p>
     <w:p>
@@ -1287,6 +1301,13 @@
       </w:r>
     </w:p>
     <w:p>
+      <w:pPr/>
+      <w:r>
+        <w:rPr/>
+        <w:t>A severidade de cada leitura segue a ISO 10816-1, que divide a velocidade de vibração RMS em zonas de A a D conforme a classe da máquina (INTERNATIONAL ORGANIZATION FOR STANDARDIZATION, 1995). O motor de 2,2 kW é Classe I, e o Metric Contract da Sprint 3 adotou 1,8 mm/s (início da zona C) como atenção e 4,5 mm/s (zona D) como crítico, além de 70 °C e 90 °C para temperatura e 2 g e 4 g para aceleração (GOMES et al., 2026). Cabe uma ressalva: a ISO 10816-1 foi substituída pela ISO 20816-1 em 2016, e uma revisão futura do contrato deveria conferir os limiares na norma vigente.</w:t>
+      </w:r>
+    </w:p>
+    <w:p>
       <w:pPr>
         <w:pStyle w:val="Heading2"/>
       </w:pPr>
@@ -1342,7 +1363,7 @@
       <w:pPr/>
       <w:r>
         <w:rPr/>
-        <w:t>A leitura atual devolve valor, unidade, timestamp da leitura, severidade (normal, alerta, critico ou indeterminada, quando o valor veio nulo), os limiares do sensor, a idade do dado em segundos e um campo desatualizado, verdadeiro quando a idade passa de 300 s. Esse campo é a implementação na própria API de uma das ações do plano de resposta (seção 7). A Figura 1 resume o fluxo.</w:t>
+        <w:t>A leitura atual devolve, para S1 ou S2, a velocidade de vibração (mm/s), a aceleração (g), a temperatura (°C), o timestamp da leitura, a severidade de cada grandeza e a geral (a pior das três), se o motor está ligado (vibração a partir de 0,3 mm/s), a idade do dado em segundos e um campo offline, verdadeiro quando a idade passa de 30 s. Esse campo implementa na API o circuit breaker da Sprint 3, que proíbe decidir pelo último valor quando o sensor está offline. A Figura 1 resume o fluxo.</w:t>
       </w:r>
     </w:p>
     <w:p>
@@ -1440,7 +1461,7 @@
       <w:pPr/>
       <w:r>
         <w:rPr/>
-        <w:t>Todo cliente da API deve enviar dois headers. X-Session-Id identifica a sessão: a interface Streamlit gera um UUID por sessão do navegador e guarda no session_state (STREAMLIT, 2026), e o script de consumo gera um por execução. X-Feature identifica a funcionalidade de origem, com valores como tela-leitura-atual, tela-historico, tela-observabilidade e script-historico.</w:t>
+        <w:t>Todo cliente da API deve enviar dois headers. X-Session-Id identifica a sessão: a interface Streamlit gera um UUID por sessão do navegador e guarda no session_state (STREAMLIT, 2026), e o script de consumo gera um por execução. X-Feature identifica a funcionalidade de origem, com valores como tela-leitura-atual, tela-historico, tela-observabilidade e script-historico. O forzy-api já gravava um session_id fixo (poller) na tabela de leituras brutas; aqui o identificador passa a vir de quem consulta.</w:t>
       </w:r>
     </w:p>
     <w:p>
@@ -2010,21 +2031,28 @@
         <w:pStyle w:val="Heading2"/>
       </w:pPr>
       <w:r>
-        <w:t>3.4 Provider simulado</w:t>
+        <w:t>3.4 Origem dos dados: histórico real e coleta simulada</w:t>
       </w:r>
     </w:p>
     <w:p>
       <w:pPr/>
       <w:r>
         <w:rPr/>
-        <w:t>O provider de Sensores construído em aula não foi copiado para este repositório. Para que o checkpoint rode em qualquer máquina sem depender de outra fonte de dados, o grupo escreveu um provider simulado com a mesma interface (leitura atual e histórico por tag) e quatro tags: TT-101 (temperatura do mancal do motor M-01, em °C), PT-201 (pressão de descarga da bomba B-02, em bar), VT-301 (vibração do redutor R-03, em mm/s) e CT-501 (corrente do motor M-05, em A). A amostragem nominal é de 30 s e cada amostra leva de 3 a 20 s para ser publicada.</w:t>
+        <w:t>Os sensores da Forzy hoje devolvem dado zerado, defeito confirmado pelo fabricante, e nos dias em que funcionaram mandaram cerca de 10 minutos de dados no total (GOMES et al., 2026). Por isso o provider deste checkpoint usa o mesmo recurso do modo demonstração do forzy-api: o histórico real exportado do mestre IO-Link em 19/05/2026, com 7.183 linhas e 3,95 horas de velocidade, aceleração e temperatura das portas 1 (S1) e 2 (S2). O arquivo foi copiado sem alteração para o repositório.</w:t>
       </w:r>
     </w:p>
     <w:p>
       <w:pPr/>
       <w:r>
         <w:rPr/>
-        <w:t>As leituras são determinísticas: a mesma tag no mesmo instante sempre gera o mesmo valor, o que deixa o histórico estável entre consultas. O simulador reproduz de propósito problemas comuns de coleta. Em 2% dos instantes a amostra se perde. Em cada janela de 4 minutos há 10% de chance de o coletor parar por 1 a 7 minutos. Valor nulo aparece em 1% das amostras e qualidade nula em 3%. A consulta tem latência variável, com 2% de consultas lentas (250 a 600 ms a mais), e a fonte falha com 0,4% de probabilidade, o que gera 503. Sem essas falhas todos os indicadores de dado ficariam em 100% e o contrato não teria o que verificar.</w:t>
+        <w:t>O registrador do IO-Link grava uma linha quando o valor muda, então com o motor parado aparecem intervalos de até 228 s sem linha, que não são falha de coleta. Para não confundir as duas coisas, o provider imita o pipeline real: a cada 10 s um poller lê o último valor de cada sensor, como faz o forzy_poller.py, e grava a leitura. O histórico é repetido em laço sobre o relógio atual, a partir de um ponto configurável (padrão 13:38, ajustável pela variável FORZY_REPLAY_INICIO), e valores fora da faixa física válida da Sprint 3 são anulados.</w:t>
+      </w:r>
+    </w:p>
+    <w:p>
+      <w:pPr/>
+      <w:r>
+        <w:rPr/>
+        <w:t>O que é simulado é a coleta e o custo da consulta. Em cada janela de 4 minutos há 10% de chance de o endpoint dos sensores ficar fora do ar por 1 a 7 minutos, derrubando S1 e S2 juntos, e 2% dos polls se perdem individualmente. A consulta ao banco tem latência variável, com 2% de consultas lentas (250 a 600 ms a mais), e falha com 0,4% de probabilidade, o que gera 503. Com isso os indicadores de dado têm o que medir, e os valores do motor, que alimentam a severidade, continuam sendo os medidos de fato.</w:t>
       </w:r>
     </w:p>
     <w:p>
@@ -2039,7 +2067,7 @@
       <w:pPr/>
       <w:r>
         <w:rPr/>
-        <w:t>O metric contract fica no arquivo governanca/metric_contract.yaml, versionado junto com o código. Para cada indicador ele traz nome, definição, fórmula, campo de origem no registro, janela de medição, unidade, direção (se valor maior ou menor é pior), baseline, limiar de alerta, limiar crítico, justificativa, visualização recomendada, ação em cada nível e responsável. O mesmo arquivo é lido pela rota de resumo da API, pela interface e pelo script de análise, então mudar um limiar no YAML muda o status em todos os lugares.</w:t>
+        <w:t>O Metric Contract da Sprint 3 normatizou a interpretação dos sensores: limiares de vibração, temperatura e aceleração, faixas físicas válidas e o circuit breaker para dado offline ou lacuna. O contrato deste checkpoint parte dele e cobre o que ficou de fora: o comportamento da API e a qualidade do dado no momento em que é entregue a quem consulta. Ele fica no arquivo governanca/metric_contract.yaml, versionado junto com o código. Para cada indicador ele traz nome, definição, fórmula, campo de origem no registro, janela de medição, unidade, direção (se valor maior ou menor é pior), baseline, limiar de alerta, limiar crítico, justificativa, visualização recomendada, ação em cada nível e responsável. O mesmo arquivo é lido pela rota de resumo da API, pela interface e pelo script de análise, então mudar um limiar no YAML muda o status em todos os lugares.</w:t>
       </w:r>
     </w:p>
     <w:p>
@@ -2674,7 +2702,7 @@
               <w:pStyle w:val="Celula"/>
             </w:pPr>
             <w:r>
-              <w:t>Percentual de leituras atuais entregues dentro do prazo de 90 s.</w:t>
+              <w:t>Percentual de leituras atuais entregues dentro do prazo de 30 s (sensor online).</w:t>
             </w:r>
           </w:p>
         </w:tc>
@@ -2687,7 +2715,7 @@
               <w:pStyle w:val="Celula"/>
             </w:pPr>
             <w:r>
-              <w:t>leituras com idade_dado_s &lt;= 90 / leituras atuais com status 200 x 100</w:t>
+              <w:t>leituras com idade_dado_s &lt;= 30 / leituras atuais com status 200 x 100</w:t>
             </w:r>
           </w:p>
         </w:tc>
@@ -3210,7 +3238,7 @@
               <w:pStyle w:val="Celula"/>
             </w:pPr>
             <w:r>
-              <w:t>Percentual de leituras atuais com severidade crítica.</w:t>
+              <w:t>Percentual de leituras atuais com severidade crítica (zona D da ISO 10816-1 ou temperatura acima de 90 °C).</w:t>
             </w:r>
           </w:p>
         </w:tc>
@@ -3268,7 +3296,7 @@
       <w:pPr/>
       <w:r>
         <w:rPr/>
-        <w:t>Alguns indicadores do enunciado precisaram de interpretação. Tempo de atualização foi entendido como o intervalo entre leituras consecutivas que o histórico devolve, e por isso só existe nas chamadas de histórico. Taxa de completude de freshness foi entendida como a fração de leituras atuais entregues dentro do prazo de 90 s, que complementa o p95 da idade: o p95 mostra o tamanho do atraso na cauda e a taxa mostra com que frequência o prazo é quebrado.</w:t>
+        <w:t>Alguns indicadores do enunciado precisaram de interpretação. Tempo de atualização foi entendido como o intervalo entre leituras consecutivas que o histórico devolve, e por isso só existe nas chamadas de histórico. Taxa de completude de freshness foi entendida como a fração de leituras atuais entregues dentro do prazo de 30 s, o critério de sensor online da Sprint 3, que complementa o p95 da idade: o p95 mostra o tamanho do atraso na cauda e a taxa mostra com que frequência o sensor estava offline. A cobertura mínima de cinco leituras válidas em 5 minutos, também da Sprint 3, aparece aqui pelo tempo de atualização e pela maior lacuna, e a faixa física válida aparece pela completude.</w:t>
       </w:r>
     </w:p>
     <w:p>
@@ -3291,14 +3319,14 @@
       <w:pPr/>
       <w:r>
         <w:rPr/>
-        <w:t>A baseline foi calculada sobre registros reais gravados pela API, gerados pelo script scripts/gerar_trafego.py no cenário baseline. Esse cenário simula a operação normal: seis sessões da interface, todas com os dois headers, só tags válidas e uma chamada por vez. A execução ocorreu em 05/10/2026, das 00:21:41 às 00:26:39 (UTC), e produziu 300 registros. As falhas do provider simulado (perda de amostra, parada do coletor, campo nulo, 503 ocasional) continuaram ativas, porque fazem parte da operação normal de um coletor industrial. O que o cenário baseline não tem são os problemas de cliente.</w:t>
+        <w:t>A baseline foi calculada sobre registros reais gravados pela API, gerados pelo script scripts/gerar_trafego.py no cenário baseline. Esse cenário simula o uso normal: seis sessões da interface, todas com os dois headers, só os sensores S1 e S2 e uma chamada por vez. A API foi iniciada logo antes, com o replay no trecho das 13:38 do histórico, então a baseline coincidiu com o motor parado e a avaliação pegou a partida das 13:44 e a operação plena que vem depois. A execução ocorreu em 05/10/2026, das 00:54:44 às 00:59:43 (UTC), e produziu 300 registros. As falhas do provider simulado (perda de amostra, parada do endpoint, 503 ocasional) continuaram ativas, porque fazem parte da operação normal da coleta. O que o cenário baseline não tem são os problemas de cliente.</w:t>
       </w:r>
     </w:p>
     <w:p>
       <w:pPr/>
       <w:r>
         <w:rPr/>
-        <w:t>Em seguida rodamos o cenário avaliacao, das 00:26:40 às 00:34:38, com 600 chamadas e concorrência 3. Nele entram, além das telas, uma integração com o MES que faz polling da leitura atual, um cliente legado sem headers, chamadas com só um header, consultas a tags inexistentes e parâmetros fora da faixa. A conformidade da seção 8 é medida sobre esse segundo período. O script governanca/analise.py separa as duas janelas pelo arquivo data/execucoes.json e, com a opção --gravar-baseline, escreve os valores medidos no próprio contrato.</w:t>
+        <w:t>Em seguida rodamos o cenário avaliacao, das 00:59:44 às 01:07:42, com 600 chamadas e concorrência 3. Nele entram, além das telas, uma integração com o MES que faz polling da leitura atual, um cliente legado sem headers, chamadas com só um header, consultas a sensores inexistentes e parâmetros fora da faixa. A conformidade da seção 8 é medida sobre esse segundo período. O script governanca/analise.py separa as duas janelas pelo arquivo data/execucoes.json e, com a opção --gravar-baseline, escreve os valores medidos no próprio contrato.</w:t>
       </w:r>
     </w:p>
     <w:p>
@@ -3320,7 +3348,7 @@
       <w:pPr/>
       <w:r>
         <w:rPr/>
-        <w:t>Os limiares foram definidos antes de olhar os resultados da avaliação, a partir de três referências: a experiência do operador na interface (tempo de resposta percebido), a característica do sensor (amostragem de 30 s e atraso de publicação de até 20 s) e a prática de SLO descrita por Beyer et al. (2016). A Tabela 1 mostra a baseline medida ao lado dos dois níveis de limiar.</w:t>
+        <w:t>Os limiares foram definidos antes de olhar os resultados da avaliação, a partir de três referências: a experiência do operador na interface (tempo de resposta percebido), as regras de qualidade de dado do Metric Contract da Sprint 3 (poll de 10 s, offline acima de 30 s, janela de diagnóstico de 5 minutos) e a prática de SLO descrita por Beyer et al. (2016). A Tabela 1 mostra a baseline medida ao lado dos dois níveis de limiar.</w:t>
       </w:r>
     </w:p>
     <w:p>
@@ -3507,7 +3535,7 @@
               <w:pStyle w:val="Celula"/>
             </w:pPr>
             <w:r>
-              <w:t>44,03</w:t>
+              <w:t>50,55</w:t>
             </w:r>
           </w:p>
         </w:tc>
@@ -3574,7 +3602,7 @@
               <w:pStyle w:val="Celula"/>
             </w:pPr>
             <w:r>
-              <w:t>17,01</w:t>
+              <w:t>17,61</w:t>
             </w:r>
           </w:p>
         </w:tc>
@@ -3641,7 +3669,7 @@
               <w:pStyle w:val="Celula"/>
             </w:pPr>
             <w:r>
-              <w:t>75,99</w:t>
+              <w:t>120,56</w:t>
             </w:r>
           </w:p>
         </w:tc>
@@ -3708,7 +3736,7 @@
               <w:pStyle w:val="Celula"/>
             </w:pPr>
             <w:r>
-              <w:t>0,67</w:t>
+              <w:t>0,00</w:t>
             </w:r>
           </w:p>
         </w:tc>
@@ -3842,7 +3870,7 @@
               <w:pStyle w:val="Celula"/>
             </w:pPr>
             <w:r>
-              <w:t>99,33</w:t>
+              <w:t>100,00</w:t>
             </w:r>
           </w:p>
         </w:tc>
@@ -3909,7 +3937,7 @@
               <w:pStyle w:val="Celula"/>
             </w:pPr>
             <w:r>
-              <w:t>44,00</w:t>
+              <w:t>9,90</w:t>
             </w:r>
           </w:p>
         </w:tc>
@@ -3922,7 +3950,7 @@
               <w:pStyle w:val="Celula"/>
             </w:pPr>
             <w:r>
-              <w:t>&gt; 90</w:t>
+              <w:t>&gt; 30</w:t>
             </w:r>
           </w:p>
         </w:tc>
@@ -4043,7 +4071,7 @@
               <w:pStyle w:val="Celula"/>
             </w:pPr>
             <w:r>
-              <w:t>99,30</w:t>
+              <w:t>100,00</w:t>
             </w:r>
           </w:p>
         </w:tc>
@@ -4110,7 +4138,7 @@
               <w:pStyle w:val="Celula"/>
             </w:pPr>
             <w:r>
-              <w:t>32,40</w:t>
+              <w:t>10,40</w:t>
             </w:r>
           </w:p>
         </w:tc>
@@ -4123,7 +4151,7 @@
               <w:pStyle w:val="Celula"/>
             </w:pPr>
             <w:r>
-              <w:t>&gt; 36</w:t>
+              <w:t>&gt; 12</w:t>
             </w:r>
           </w:p>
         </w:tc>
@@ -4136,7 +4164,7 @@
               <w:pStyle w:val="Celula"/>
             </w:pPr>
             <w:r>
-              <w:t>&gt; 45</w:t>
+              <w:t>&gt; 15</w:t>
             </w:r>
           </w:p>
         </w:tc>
@@ -4177,7 +4205,7 @@
               <w:pStyle w:val="Celula"/>
             </w:pPr>
             <w:r>
-              <w:t>330,00</w:t>
+              <w:t>160,00</w:t>
             </w:r>
           </w:p>
         </w:tc>
@@ -4190,7 +4218,7 @@
               <w:pStyle w:val="Celula"/>
             </w:pPr>
             <w:r>
-              <w:t>&gt; 120</w:t>
+              <w:t>&gt; 30</w:t>
             </w:r>
           </w:p>
         </w:tc>
@@ -4311,7 +4339,7 @@
               <w:pStyle w:val="Celula"/>
             </w:pPr>
             <w:r>
-              <w:t>60,23</w:t>
+              <w:t>60,20</w:t>
             </w:r>
           </w:p>
         </w:tc>
@@ -4423,7 +4451,7 @@
       <w:pPr/>
       <w:r>
         <w:rPr/>
-        <w:t>Latência. Na interface cada interação dispara até três chamadas. Com p95 de 250 ms por chamada a soma fica abaixo de 1 s, faixa em que a resposta ainda parece imediata; acima de 1 s por chamada a tela trava de forma visível. A baseline de p95 ficou em 44,0 ms, bem abaixo do alerta, o que é esperado num ambiente local. O p99 tem janela de 15 minutos porque, com poucas chamadas, o p99 de 5 minutos oscila demais.</w:t>
+        <w:t>Latência. Na interface cada interação dispara até três chamadas. Com p95 de 250 ms por chamada a soma fica abaixo de 1 s, faixa em que a resposta ainda parece imediata; acima de 1 s por chamada a tela trava de forma visível. A baseline de p95 ficou em 50,5 ms, bem abaixo do alerta, o que é esperado num ambiente local. O p99 tem janela de 15 minutos porque, com poucas chamadas, o p99 de 5 minutos oscila demais.</w:t>
       </w:r>
     </w:p>
     <w:p>
@@ -4437,14 +4465,14 @@
       <w:pPr/>
       <w:r>
         <w:rPr/>
-        <w:t>Freshness e tempo de atualização. Uma leitura saudável tem até cerca de 50 s de idade (30 s de amostragem mais 20 s de publicação). Passar de 90 s quer dizer que pelo menos duas amostras seguidas não chegaram, e acima de 5 minutos o dado já não serve para decidir nada sobre o equipamento. Para o intervalo entre leituras, a média 20% acima do nominal (36 s) indica perda frequente de amostras; com 45 s, uma em cada três amostras se perdeu.</w:t>
+        <w:t>Freshness e tempo de atualização. Com poll a cada 10 s, uma leitura saudável tem até cerca de 11 s de idade. O alerta em 30 s é o critério de sensor offline da Sprint 3, e o crítico em 300 s corresponde a uma janela de diagnóstico de 5 minutos inteira sem dado novo. Para o intervalo entre leituras, a média 20% acima do nominal (12 s) indica perda frequente de polls; com 15 s, uma em cada três leituras se perdeu. A maior lacuna usa os mesmos 30 s e 300 s.</w:t>
       </w:r>
     </w:p>
     <w:p>
       <w:pPr/>
       <w:r>
         <w:rPr/>
-        <w:t>Completude e cobertura. A completude tolera 2% de campos faltando antes do alerta porque um campo nulo isolado, como a qualidade, não impede a leitura. A cobertura de headers tem meta de 95% e não de 100% para aceitar chamadas manuais de teste pelo /docs. Volume não tem valor certo, depende do turno, então o limiar é relativo à baseline: o que preocupa é a queda brusca, sinal de cliente parado. A proporção de leituras críticas é um indicador do equipamento e não da API; 5% e 10% são pontos de partida que a engenharia de manutenção deveria revisar.</w:t>
+        <w:t>Completude e cobertura. A completude tolera 2% de campos faltando antes do alerta porque um campo nulo isolado, como a qualidade, não impede a leitura. A cobertura de headers tem meta de 95% e não de 100% para aceitar chamadas manuais de teste pelo /docs. Volume não tem valor certo, depende do turno, então o limiar é relativo à baseline: o que preocupa é a queda brusca, sinal de cliente parado. A proporção de leituras críticas é um indicador do equipamento e não da API. Ela usa a severidade calculada com os limiares da Sprint 3, e 5% e 10% são pontos de partida que o Técnico N2 e o Gestor N3 deveriam revisar.</w:t>
       </w:r>
     </w:p>
     <w:p>
@@ -5637,7 +5665,7 @@
       <w:r>
         <w:drawing>
           <wp:inline xmlns:a="http://schemas.openxmlformats.org/drawingml/2006/main" xmlns:pic="http://schemas.openxmlformats.org/drawingml/2006/picture">
-            <wp:extent cx="5580000" cy="2894978"/>
+            <wp:extent cx="5580000" cy="2901276"/>
             <wp:docPr id="9" name="Picture 9"/>
             <wp:cNvGraphicFramePr>
               <a:graphicFrameLocks noChangeAspect="1"/>
@@ -5658,7 +5686,7 @@
                   <pic:spPr>
                     <a:xfrm>
                       <a:off x="0" y="0"/>
-                      <a:ext cx="5580000" cy="2894978"/>
+                      <a:ext cx="5580000" cy="2901276"/>
                     </a:xfrm>
                     <a:prstGeom prst="rect"/>
                   </pic:spPr>
@@ -5941,7 +5969,7 @@
       <w:r>
         <w:drawing>
           <wp:inline xmlns:a="http://schemas.openxmlformats.org/drawingml/2006/main" xmlns:pic="http://schemas.openxmlformats.org/drawingml/2006/picture">
-            <wp:extent cx="5580000" cy="2029359"/>
+            <wp:extent cx="5580000" cy="2012315"/>
             <wp:docPr id="13" name="Picture 13"/>
             <wp:cNvGraphicFramePr>
               <a:graphicFrameLocks noChangeAspect="1"/>
@@ -5962,7 +5990,7 @@
                   <pic:spPr>
                     <a:xfrm>
                       <a:off x="0" y="0"/>
-                      <a:ext cx="5580000" cy="2029359"/>
+                      <a:ext cx="5580000" cy="2012315"/>
                     </a:xfrm>
                     <a:prstGeom prst="rect"/>
                   </pic:spPr>
@@ -6467,7 +6495,7 @@
               <w:pStyle w:val="Celula"/>
             </w:pPr>
             <w:r>
-              <w:t>Mostrar na interface o aviso de dado atrasado e verificar o coletor da tag afetada (fila, conexão com o CLP).</w:t>
+              <w:t>Marcar o sensor como offline na interface (circuit breaker do CS3: não decidir pelo último valor) e verificar a conectividade do endpoint dos sensores, não o motor.</w:t>
             </w:r>
           </w:p>
         </w:tc>
@@ -6480,7 +6508,7 @@
               <w:pStyle w:val="Celula"/>
             </w:pPr>
             <w:r>
-              <w:t>Marcar a leitura como "dado desatualizado", não usar a leitura para cálculo de severidade nem para inferência do modelo, notificar o responsável pelo coletor.</w:t>
+              <w:t>Suspender o diagnóstico do motor, não usar a leitura para severidade nem para inferência do modelo e abrir chamado de conectividade IoT.</w:t>
             </w:r>
           </w:p>
         </w:tc>
@@ -6493,7 +6521,7 @@
               <w:pStyle w:val="Celula"/>
             </w:pPr>
             <w:r>
-              <w:t>Engenharia de dados (coletor)</w:t>
+              <w:t>Engenharia de dados (poller e endpoints)</w:t>
             </w:r>
           </w:p>
         </w:tc>
@@ -6521,7 +6549,7 @@
               <w:pStyle w:val="Celula"/>
             </w:pPr>
             <w:r>
-              <w:t>Levantar quais tags concentram os atrasos e checar o coletor delas.</w:t>
+              <w:t>Levantar em quais horários e sensores o dado ficou offline e checar o endpoint e o poller.</w:t>
             </w:r>
           </w:p>
         </w:tc>
@@ -6534,7 +6562,7 @@
               <w:pStyle w:val="Celula"/>
             </w:pPr>
             <w:r>
-              <w:t>Registrar incidente de qualidade de dado e suspender alertas automáticos baseados nessas tags.</w:t>
+              <w:t>Registrar incidente de qualidade de dado e rebaixar os alertas automáticos do período para revisão humana.</w:t>
             </w:r>
           </w:p>
         </w:tc>
@@ -6547,7 +6575,7 @@
               <w:pStyle w:val="Celula"/>
             </w:pPr>
             <w:r>
-              <w:t>Engenharia de dados (coletor)</w:t>
+              <w:t>Engenharia de dados (poller e endpoints)</w:t>
             </w:r>
           </w:p>
         </w:tc>
@@ -6575,7 +6603,7 @@
               <w:pStyle w:val="Celula"/>
             </w:pPr>
             <w:r>
-              <w:t>Identificar quais campos estão vindo nulos e em quais tags.</w:t>
+              <w:t>Identificar qual grandeza está saindo da faixa válida e em qual sensor.</w:t>
             </w:r>
           </w:p>
         </w:tc>
@@ -6601,7 +6629,7 @@
               <w:pStyle w:val="Celula"/>
             </w:pPr>
             <w:r>
-              <w:t>Engenharia de dados (coletor)</w:t>
+              <w:t>Engenharia de dados (poller e endpoints)</w:t>
             </w:r>
           </w:p>
         </w:tc>
@@ -6629,7 +6657,7 @@
               <w:pStyle w:val="Celula"/>
             </w:pPr>
             <w:r>
-              <w:t>Verificar a taxa de amostragem configurada no coletor.</w:t>
+              <w:t>Verificar o log do poller (falhas de GET nos endpoints dos sensores).</w:t>
             </w:r>
           </w:p>
         </w:tc>
@@ -6655,7 +6683,7 @@
               <w:pStyle w:val="Celula"/>
             </w:pPr>
             <w:r>
-              <w:t>Engenharia de dados (coletor)</w:t>
+              <w:t>Engenharia de dados (poller e endpoints)</w:t>
             </w:r>
           </w:p>
         </w:tc>
@@ -6683,7 +6711,7 @@
               <w:pStyle w:val="Celula"/>
             </w:pPr>
             <w:r>
-              <w:t>Cruzar o horário da lacuna com os logs do coletor.</w:t>
+              <w:t>Cruzar o horário da lacuna com o log do poller.</w:t>
             </w:r>
           </w:p>
         </w:tc>
@@ -6696,7 +6724,7 @@
               <w:pStyle w:val="Celula"/>
             </w:pPr>
             <w:r>
-              <w:t>Registrar a parada como incidente do coletor.</w:t>
+              <w:t>Registrar a parada como incidente de coleta e marcar o trecho no gráfico de histórico.</w:t>
             </w:r>
           </w:p>
         </w:tc>
@@ -6709,7 +6737,7 @@
               <w:pStyle w:val="Celula"/>
             </w:pPr>
             <w:r>
-              <w:t>Engenharia de dados (coletor)</w:t>
+              <w:t>Engenharia de dados (poller e endpoints)</w:t>
             </w:r>
           </w:p>
         </w:tc>
@@ -6845,7 +6873,7 @@
               <w:pStyle w:val="Celula"/>
             </w:pPr>
             <w:r>
-              <w:t>Avisar a engenharia de manutenção e conferir se a tag tem histórico de falso positivo.</w:t>
+              <w:t>Notificar o Técnico N2 e conferir se o motor estava em teste de carga ou partida.</w:t>
             </w:r>
           </w:p>
         </w:tc>
@@ -6858,7 +6886,7 @@
               <w:pStyle w:val="Celula"/>
             </w:pPr>
             <w:r>
-              <w:t>Abrir ordem de inspeção do equipamento e verificar a calibração do sensor.</w:t>
+              <w:t>Abrir ordem de serviço; qualquer parada exige aprovação do Gestor N3, como no CS3.</w:t>
             </w:r>
           </w:p>
         </w:tc>
@@ -6871,7 +6899,7 @@
               <w:pStyle w:val="Celula"/>
             </w:pPr>
             <w:r>
-              <w:t>Engenharia de manutenção</w:t>
+              <w:t>Técnico N2 (manutenção) e Gestor N3</w:t>
             </w:r>
           </w:p>
         </w:tc>
@@ -6890,7 +6918,7 @@
       <w:pPr/>
       <w:r>
         <w:rPr/>
-        <w:t>Duas ações já estão implementadas no código. A leitura atual traz o campo desatualizado quando a idade passa de 300 s, e a interface mostra o aviso de dado desatualizado e diz que a severidade não deve ser usada para decisão. A interface também avisa quando o campo de qualidade vem vazio. As demais ações dependem de processo (chamado, plantão, contato com o dono do cliente) e ficam como proposta para a Sprint 4, quando houver alertas automáticos.</w:t>
+        <w:t>Três ações já estão implementadas no código. A leitura atual traz o campo offline quando a idade passa de 30 s, e a interface avisa que, pelo circuit breaker, a severidade não deve ser usada para decisão. Com o motor abaixo de 0,3 mm/s a interface informa que o diagnóstico não se aplica, como manda a Sprint 3. Valores fora da faixa física válida são anulados antes de chegar ao cliente. As demais ações dependem de processo (chamado, plantão, contato com o dono do cliente) e ficam como proposta para a Sprint 4, quando houver alertas automáticos. Os papéis Técnico N2 e Gestor N3 são os do RBAC definido na Sprint 1.</w:t>
       </w:r>
     </w:p>
     <w:p>
@@ -7106,7 +7134,7 @@
               <w:pStyle w:val="Celula"/>
             </w:pPr>
             <w:r>
-              <w:t>40,80 ms</w:t>
+              <w:t>40,05 ms</w:t>
             </w:r>
           </w:p>
         </w:tc>
@@ -7119,7 +7147,7 @@
               <w:pStyle w:val="Celula"/>
             </w:pPr>
             <w:r>
-              <w:t>44,03</w:t>
+              <w:t>50,55</w:t>
             </w:r>
           </w:p>
         </w:tc>
@@ -7186,7 +7214,7 @@
               <w:pStyle w:val="Celula"/>
             </w:pPr>
             <w:r>
-              <w:t>15,32 ms</w:t>
+              <w:t>15,33 ms</w:t>
             </w:r>
           </w:p>
         </w:tc>
@@ -7199,7 +7227,7 @@
               <w:pStyle w:val="Celula"/>
             </w:pPr>
             <w:r>
-              <w:t>17,01</w:t>
+              <w:t>17,61</w:t>
             </w:r>
           </w:p>
         </w:tc>
@@ -7266,7 +7294,7 @@
               <w:pStyle w:val="Celula"/>
             </w:pPr>
             <w:r>
-              <w:t>442,72 ms</w:t>
+              <w:t>517,13 ms</w:t>
             </w:r>
           </w:p>
         </w:tc>
@@ -7279,7 +7307,7 @@
               <w:pStyle w:val="Celula"/>
             </w:pPr>
             <w:r>
-              <w:t>75,99</w:t>
+              <w:t>120,56</w:t>
             </w:r>
           </w:p>
         </w:tc>
@@ -7346,7 +7374,7 @@
               <w:pStyle w:val="Celula"/>
             </w:pPr>
             <w:r>
-              <w:t>0,17%</w:t>
+              <w:t>0,00%</w:t>
             </w:r>
           </w:p>
         </w:tc>
@@ -7359,7 +7387,7 @@
               <w:pStyle w:val="Celula"/>
             </w:pPr>
             <w:r>
-              <w:t>0,67</w:t>
+              <w:t>0,00</w:t>
             </w:r>
           </w:p>
         </w:tc>
@@ -7506,7 +7534,7 @@
               <w:pStyle w:val="Celula"/>
             </w:pPr>
             <w:r>
-              <w:t>99,83%</w:t>
+              <w:t>100,00%</w:t>
             </w:r>
           </w:p>
         </w:tc>
@@ -7519,7 +7547,7 @@
               <w:pStyle w:val="Celula"/>
             </w:pPr>
             <w:r>
-              <w:t>99,33</w:t>
+              <w:t>100,00</w:t>
             </w:r>
           </w:p>
         </w:tc>
@@ -7586,7 +7614,7 @@
               <w:pStyle w:val="Celula"/>
             </w:pPr>
             <w:r>
-              <w:t>285,70 s</w:t>
+              <w:t>10,10 s</w:t>
             </w:r>
           </w:p>
         </w:tc>
@@ -7599,7 +7627,7 @@
               <w:pStyle w:val="Celula"/>
             </w:pPr>
             <w:r>
-              <w:t>44,00</w:t>
+              <w:t>9,90</w:t>
             </w:r>
           </w:p>
         </w:tc>
@@ -7612,7 +7640,7 @@
               <w:pStyle w:val="Celula"/>
             </w:pPr>
             <w:r>
-              <w:t>90</w:t>
+              <w:t>30</w:t>
             </w:r>
           </w:p>
         </w:tc>
@@ -7638,7 +7666,7 @@
               <w:pStyle w:val="Celula"/>
             </w:pPr>
             <w:r>
-              <w:t>Alerta</w:t>
+              <w:t>Dentro</w:t>
             </w:r>
           </w:p>
         </w:tc>
@@ -7666,7 +7694,7 @@
               <w:pStyle w:val="Celula"/>
             </w:pPr>
             <w:r>
-              <w:t>80,42%</w:t>
+              <w:t>100,00%</w:t>
             </w:r>
           </w:p>
         </w:tc>
@@ -7718,7 +7746,7 @@
               <w:pStyle w:val="Celula"/>
             </w:pPr>
             <w:r>
-              <w:t>Crítico</w:t>
+              <w:t>Dentro</w:t>
             </w:r>
           </w:p>
         </w:tc>
@@ -7746,7 +7774,7 @@
               <w:pStyle w:val="Celula"/>
             </w:pPr>
             <w:r>
-              <w:t>99,40%</w:t>
+              <w:t>100,00%</w:t>
             </w:r>
           </w:p>
         </w:tc>
@@ -7759,7 +7787,7 @@
               <w:pStyle w:val="Celula"/>
             </w:pPr>
             <w:r>
-              <w:t>99,30</w:t>
+              <w:t>100,00</w:t>
             </w:r>
           </w:p>
         </w:tc>
@@ -7826,7 +7854,7 @@
               <w:pStyle w:val="Celula"/>
             </w:pPr>
             <w:r>
-              <w:t>32,50 s</w:t>
+              <w:t>10,30 s</w:t>
             </w:r>
           </w:p>
         </w:tc>
@@ -7839,7 +7867,7 @@
               <w:pStyle w:val="Celula"/>
             </w:pPr>
             <w:r>
-              <w:t>32,40</w:t>
+              <w:t>10,40</w:t>
             </w:r>
           </w:p>
         </w:tc>
@@ -7852,7 +7880,7 @@
               <w:pStyle w:val="Celula"/>
             </w:pPr>
             <w:r>
-              <w:t>36</w:t>
+              <w:t>12</w:t>
             </w:r>
           </w:p>
         </w:tc>
@@ -7865,7 +7893,7 @@
               <w:pStyle w:val="Celula"/>
             </w:pPr>
             <w:r>
-              <w:t>45</w:t>
+              <w:t>15</w:t>
             </w:r>
           </w:p>
         </w:tc>
@@ -7906,7 +7934,7 @@
               <w:pStyle w:val="Celula"/>
             </w:pPr>
             <w:r>
-              <w:t>330,00 s</w:t>
+              <w:t>160,00 s</w:t>
             </w:r>
           </w:p>
         </w:tc>
@@ -7919,7 +7947,7 @@
               <w:pStyle w:val="Celula"/>
             </w:pPr>
             <w:r>
-              <w:t>330,00</w:t>
+              <w:t>160,00</w:t>
             </w:r>
           </w:p>
         </w:tc>
@@ -7932,7 +7960,7 @@
               <w:pStyle w:val="Celula"/>
             </w:pPr>
             <w:r>
-              <w:t>120</w:t>
+              <w:t>30</w:t>
             </w:r>
           </w:p>
         </w:tc>
@@ -7958,7 +7986,7 @@
               <w:pStyle w:val="Celula"/>
             </w:pPr>
             <w:r>
-              <w:t>Crítico</w:t>
+              <w:t>Alerta</w:t>
             </w:r>
           </w:p>
         </w:tc>
@@ -8066,7 +8094,7 @@
               <w:pStyle w:val="Celula"/>
             </w:pPr>
             <w:r>
-              <w:t>75,31 chamadas/min</w:t>
+              <w:t>75,29 chamadas/min</w:t>
             </w:r>
           </w:p>
         </w:tc>
@@ -8079,7 +8107,7 @@
               <w:pStyle w:val="Celula"/>
             </w:pPr>
             <w:r>
-              <w:t>60,23</w:t>
+              <w:t>60,20</w:t>
             </w:r>
           </w:p>
         </w:tc>
@@ -8146,7 +8174,7 @@
               <w:pStyle w:val="Celula"/>
             </w:pPr>
             <w:r>
-              <w:t>0,00%</w:t>
+              <w:t>80,47%</w:t>
             </w:r>
           </w:p>
         </w:tc>
@@ -8198,7 +8226,7 @@
               <w:pStyle w:val="Celula"/>
             </w:pPr>
             <w:r>
-              <w:t>Dentro</w:t>
+              <w:t>Crítico</w:t>
             </w:r>
           </w:p>
         </w:tc>
@@ -8217,56 +8245,63 @@
       <w:pPr/>
       <w:r>
         <w:rPr/>
-        <w:t>Dos 14 indicadores com limiar, 9 ficaram dentro, 2 em alerta e 3 em nível crítico. Também foram registradas 11 sessões únicas.</w:t>
+        <w:t>Dos 14 indicadores com limiar, 10 ficaram dentro, 2 em alerta e 2 em nível crítico. Também foram registradas 11 sessões únicas.</w:t>
       </w:r>
     </w:p>
     <w:p>
       <w:pPr/>
       <w:r>
         <w:rPr/>
-        <w:t>O problema mais sério apareceu nos indicadores de dado. A partir das 00:30:04 a tag CT-501 passou a responder com leituras cada vez mais velhas, até 368 s, sinal de que o coletor dessa tag parou (Figura 6). Foram 62 leituras acima de 90 s só dessa tag; a VT-301 teve mais 13, com no máximo 149 s. Com isso a taxa de completude de freshness caiu para 80,4%, abaixo do limiar crítico de 90%, e a Figura 7 mostra a queda janela a janela. O p95 da idade ficou em 285,7 s, em alerta e perto do crítico. Ao todo, 16 respostas passaram de 300 s e saíram com o campo desatualizado marcado, que é a ação crítica do contrato funcionando na prática.</w:t>
+        <w:t>O resultado mais importante não veio da API, e sim do motor. Na baseline, com o motor parado, as 175 leituras atuais saíram todas normais. Na avaliação o replay chegou à partida das 13:44 e à operação plena, e 309 das 384 leituras saíram críticas, uma proporção de 80,5%, muito acima do limiar de 10% (Figura 13). A causa é só a vibração: no histórico inteiro a temperatura não passou de 47 °C e a aceleração não passou de 0,60 g, longe dos limiares, enquanto o platô de operação fica em 6,61 mm/s no S1 e 6,74 mm/s no S2, dentro da zona D da Classe I (acima de 4,5 mm/s).</w:t>
       </w:r>
     </w:p>
     <w:p>
       <w:pPr/>
       <w:r>
         <w:rPr/>
-        <w:t>A mesma parada não apareceu no indicador de maior lacuna do histórico. A lacuna só pode ser medida quando a leitura seguinte chega, e o coletor da CT-501 ainda estava parado no fim da avaliação, então o histórico simplesmente terminava mais cedo. Isso mostra que os dois indicadores se completam: freshness pega a parada em curso e a lacuna registra a parada depois que ela acaba. O valor de 330 s que deixou a maior lacuna em nível crítico veio de paradas anteriores das tags CT-501 e TT-101, que já estavam na última hora de histórico durante a baseline. O tempo médio de atualização ficou em 32,5 s, dentro do limiar, porque poucas lacunas longas pesam pouco na média (Figura 9).</w:t>
+        <w:t>Contando as linhas do histórico de 19/05 com o motor ligado, 57,6% (S1) e 58,7% (S2) estão na zona D. Esses percentuais são por linha do registrador, que grava mais linhas com o motor em movimento, então servem como ordem de grandeza e não como tempo exato. O documento da Sprint 3 cita cerca de 0,57 mm/s como leitura em operação normal, valor bem abaixo do platô e que, nesse histórico, só aparece fora dele. Ou o motor está de fato numa condição de vibração inaceitável, ou os limiares da Classe I não se aplicam a esta montagem (motor em bancada, posição do sensor), ou o valor de referência da Sprint 3 veio de outro período. O contrato não decide isso sozinho; é exatamente o cenário de assinatura conhecida do ativo que a Sprint 3 deixou para decisão humana, e a alteração de limiar exige o Gestor N3.</w:t>
       </w:r>
     </w:p>
     <w:p>
       <w:pPr/>
       <w:r>
         <w:rPr/>
-        <w:t>A taxa de erro 4xx chegou a 9,5%, nível crítico. Foram 35 respostas 404 e 22 respostas 422. Os 404 vieram das tags SENSOR-X (14), TT-999 (13), PT-2O1 (8). A PT-2O1 tem a letra O no lugar do zero, erro típico de tag digitada à mão. Os 422 foram pedidos de histórico com limite fora da faixa de 1 a 5000. Como essas chamadas traziam o header de feature das telas, o campo feature sozinho não basta para achar a origem; seria preciso cruzar com session_id e user_agent, que é o que a ação de alerta do contrato pede.</w:t>
+        <w:t>Nos indicadores de dado, a avaliação não pegou nenhuma queda do endpoint: o p95 da idade ficou em 10,1 s, todas as leituras chegaram dentro dos 30 s e o tempo médio de atualização foi de 10,3 s, perto dos 10 s nominais. Mesmo assim a maior lacuna ficou em 160 s, em alerta, nos dois sensores ao mesmo tempo (S1: 160 s, S2: 160 s). Foi uma queda do endpoint anterior ao teste, que ainda estava na última hora devolvida pelo histórico; como derrubou S1 e S2 juntos, aponta para a conectividade e não para um sensor. Freshness mede só o agora, e a lacuna é o indicador que guarda a memória da última hora, então os dois se completam (Figuras 6 e 9).</w:t>
       </w:r>
     </w:p>
     <w:p>
       <w:pPr/>
       <w:r>
         <w:rPr/>
-        <w:t>A cobertura de headers ficou em 90,17%, em alerta e a poucos décimos do crítico. A Figura 10 aponta a origem: 42 chamadas do cliente com user agent python-requests/legado não mandaram nenhum header, e 17 chamadas da própria interface mandaram só o X-Feature. Esse resultado sustenta a decisão de não recusar chamadas sem header: se a API tivesse respondido 400, essas chamadas não estariam no banco e não haveria como saber qual cliente corrigir.</w:t>
+        <w:t>A taxa de erro 4xx chegou a 9,5%, nível crítico. Foram 35 respostas 404 e 22 respostas 422. Os 404 vieram dos identificadores MOTOR-2 (14), S3 (13), SI (8). O SI tem a letra I no lugar do número 1, erro típico de identificador digitado à mão, e o MOTOR-2 mistura o nome do componente com a tag do sensor. Os 422 foram pedidos de histórico com limite fora da faixa de 1 a 5000. Como essas chamadas traziam o header de feature das telas, o campo feature sozinho não basta para achar a origem; é preciso cruzar com session_id e user_agent, que é o que a ação de alerta do contrato pede.</w:t>
       </w:r>
     </w:p>
     <w:p>
       <w:pPr/>
       <w:r>
         <w:rPr/>
-        <w:t>A latência ficou dentro dos limiares. O p95 foi de 40,8 ms contra 44,0 ms na baseline. O p99, porém, subiu de 76,0 ms para 442,7 ms com a concorrência maior e as consultas lentas do historiador (9 chamadas acima de 250 ms). Na Figura 2 o p99 passa do valor de alerta do p95 em alguns minutos enquanto o p95 quase não se move, o que justifica acompanhar os dois. Por rota, o p95 do histórico foi de 65,3 ms e o da leitura atual de 32,0 ms.</w:t>
+        <w:t>A cobertura de headers ficou em 90,17%, em alerta e a poucos décimos do crítico. A Figura 10 aponta a origem: 42 chamadas do cliente com user agent python-requests/legado não mandaram nenhum header, e 17 chamadas da própria interface mandaram só o X-Feature. Esse resultado sustenta a decisão de não recusar chamadas sem header: se a API tivesse respondido 400, essas chamadas não estariam no banco e não haveria como saber qual cliente corrigir.</w:t>
       </w:r>
     </w:p>
     <w:p>
       <w:pPr/>
       <w:r>
         <w:rPr/>
-        <w:t>A disponibilidade na avaliação foi de 99,83%, com 1 resposta 503 no período. Na baseline, com 2 falhas em 300 chamadas, ela ficou em 99,33%, abaixo da própria meta. Com amostras pequenas cada falha pesa muito (uma falha em 300 chamadas tira 0,33 ponto percentual), e por isso o contrato mede disponibilidade em 30 dias para o SLO e só usa a janela curta para acompanhamento. A completude do payload ficou em 99,4%, o volume em 75,3 chamadas por minuto e não houve leitura crítica no período (0,0%).</w:t>
+        <w:t>A latência ficou dentro dos limiares. O p95 foi de 40,0 ms contra 50,5 ms na baseline. O p99, porém, subiu de 120,6 ms para 517,1 ms com a concorrência maior e as consultas lentas (9 chamadas acima de 250 ms). Na Figura 2 o p99 passa do valor de alerta do p95 em alguns minutos enquanto o p95 quase não se move, o que justifica acompanhar os dois. Por rota, o p95 do histórico foi de 49,9 ms e o da leitura atual de 33,2 ms.</w:t>
       </w:r>
     </w:p>
     <w:p>
       <w:pPr/>
       <w:r>
         <w:rPr/>
-        <w:t>A própria baseline já estava fora do limiar em 3 indicadores: taxa de erro 5xx (0,67, nível alerta), disponibilidade (99,33, nível alerta) e maior lacuna no histórico (330,00, nível crítico). Os limiares foram mantidos como estavam, porque ajustá-los para caber na baseline esconderia justamente o que eles devem mostrar. Fica como achado para a revisão do contrato: ou o coletor e a fonte precisam melhorar, ou a meta precisa ser rediscutida com quem usa o dado.</w:t>
+        <w:t>A disponibilidade foi de 100,00% nas duas janelas, sem nenhuma resposta 5xx, e a completude do payload ficou em 100,0%. Este último número merece cuidado: o histórico real não tem nenhum valor fora da faixa física válida, então a completude não teve como cair aqui. Ela passa a ser útil quando o hardware voltar a mandar dado ao vivo, e o defeito de dado zerado já relatado pela Forzy é o tipo de falha que esse indicador, combinado com a faixa válida, deveria pegar. O volume ficou em 75,3 chamadas por minuto, acima da baseline, porque o cenário de avaliação tem mais clientes.</w:t>
+      </w:r>
+    </w:p>
+    <w:p>
+      <w:pPr/>
+      <w:r>
+        <w:rPr/>
+        <w:t>A própria baseline já estava fora do limiar em 1 indicador: maior lacuna no histórico (160,00, nível alerta). Os limiares foram mantidos como estavam, porque ajustá-los para caber na baseline esconderia justamente o que eles devem mostrar. Fica como achado para a revisão do contrato: ou o coletor e a fonte precisam melhorar, ou a meta precisa ser rediscutida com quem usa o dado.</w:t>
       </w:r>
     </w:p>
     <w:p>
@@ -8459,6 +8494,40 @@
       </w:r>
       <w:r>
         <w:t>. [S. l.]: FastAPI, 2026. Disponível em: https://fastapi.tiangolo.com/tutorial/middleware/. Acesso em: 4 out. 2026.</w:t>
+      </w:r>
+    </w:p>
+    <w:p>
+      <w:pPr>
+        <w:pStyle w:val="Referencia"/>
+      </w:pPr>
+      <w:r>
+        <w:t xml:space="preserve">GOMES, Matheus Cardoso et al. </w:t>
+      </w:r>
+      <w:r>
+        <w:rPr>
+          <w:b/>
+        </w:rPr>
+        <w:t>Forzy</w:t>
+      </w:r>
+      <w:r>
+        <w:t>: gêmeo digital com IA: governança em IA e business analytics: Challenge Sprint 3. São Paulo: FIAP, 2026. Documento interno do grupo.</w:t>
+      </w:r>
+    </w:p>
+    <w:p>
+      <w:pPr>
+        <w:pStyle w:val="Referencia"/>
+      </w:pPr>
+      <w:r>
+        <w:t xml:space="preserve">INTERNATIONAL ORGANIZATION FOR STANDARDIZATION. </w:t>
+      </w:r>
+      <w:r>
+        <w:rPr>
+          <w:b/>
+        </w:rPr>
+        <w:t>ISO 10816-1</w:t>
+      </w:r>
+      <w:r>
+        <w:t>: mechanical vibration: evaluation of machine vibration by measurements on non-rotating parts: part 1: general guidelines. Geneva: ISO, 1995.</w:t>
       </w:r>
     </w:p>
     <w:p>

</xml_diff>